<commit_message>
Quitar tablas con sombreado estilo zebra
</commit_message>
<xml_diff>
--- a/ejemplo.docx
+++ b/ejemplo.docx
@@ -1809,7 +1809,7 @@
         <w:tc>
           <w:tcPr>
             <w:tcW w:w="2885" w:type="dxa"/>
-            <w:shd w:val="clear" w:fill="EEF1F8"/>
+            <w:shd w:val="clear" w:fill="FFFFFF"/>
             <w:tcMar>
               <w:top w:w="40" w:type="dxa"/>
               <w:bottom w:w="40" w:type="dxa"/>
@@ -1835,7 +1835,7 @@
         <w:tc>
           <w:tcPr>
             <w:tcW w:w="1275" w:type="dxa"/>
-            <w:shd w:val="clear" w:fill="EEF1F8"/>
+            <w:shd w:val="clear" w:fill="FFFFFF"/>
             <w:tcMar>
               <w:top w:w="40" w:type="dxa"/>
               <w:bottom w:w="40" w:type="dxa"/>
@@ -1861,7 +1861,7 @@
         <w:tc>
           <w:tcPr>
             <w:tcW w:w="4610" w:type="dxa"/>
-            <w:shd w:val="clear" w:fill="EEF1F8"/>
+            <w:shd w:val="clear" w:fill="FFFFFF"/>
             <w:tcMar>
               <w:top w:w="40" w:type="dxa"/>
               <w:bottom w:w="40" w:type="dxa"/>

</xml_diff>

<commit_message>
Fix de numeración en titulos y subtitlos (Ahora se agregan auto al indice correctamente))
</commit_message>
<xml_diff>
--- a/ejemplo.docx
+++ b/ejemplo.docx
@@ -530,13 +530,16 @@
     </w:p>
     <w:p>
       <w:pPr>
-        <w:pStyle w:val="Heading2"/>
         <w:pageBreakBefore w:val="0"/>
         <w:spacing w:before="240" w:line="276" w:lineRule="auto"/>
-        <w:rPr/>
-      </w:pPr>
-      <w:r>
-        <w:rPr>
+      </w:pPr>
+      <w:r>
+        <w:rPr>
+          <w:b w:val="1"/>
+          <w:bCs w:val="1"/>
+          <w:color w:val="001689"/>
+          <w:sz w:val="28"/>
+          <w:szCs w:val="28"/>
           <w:rtl w:val="0"/>
         </w:rPr>
         <w:t xml:space="preserve">Indice</w:t>
@@ -550,7 +553,7 @@
         <w:fldChar w:fldCharType="begin" w:dirty="true"/>
       </w:r>
       <w:r>
-        <w:instrText xml:space="preserve"> TOC \o "1-2" \h \z \u </w:instrText>
+        <w:instrText xml:space="preserve"> TOC \o "1-3" \h \z \u </w:instrText>
       </w:r>
       <w:r>
         <w:fldChar w:fldCharType="separate"/>
@@ -578,7 +581,12 @@
       <w:pPr>
         <w:pStyle w:val="Heading2"/>
         <w:pageBreakBefore w:val="0"/>
+        <w:numPr>
+          <w:ilvl w:val="0"/>
+          <w:numId w:val="92"/>
+        </w:numPr>
         <w:spacing w:before="240" w:line="276" w:lineRule="auto"/>
+        <w:outlineLvl w:val="1"/>
         <w:rPr/>
       </w:pPr>
       <w:r>
@@ -854,24 +862,6 @@
       </w:r>
       <w:r>
         <w:rPr>
-          <w:b w:val="1"/>
-          <w:bCs w:val="1"/>
-          <w:sz w:val="20"/>
-          <w:szCs w:val="20"/>
-          <w:rtl w:val="0"/>
-        </w:rPr>
-        <w:t xml:space="preserve">negrita</w:t>
-      </w:r>
-      <w:r>
-        <w:rPr>
-          <w:sz w:val="20"/>
-          <w:szCs w:val="20"/>
-          <w:rtl w:val="0"/>
-        </w:rPr>
-        <w:t xml:space="preserve">, </w:t>
-      </w:r>
-      <w:r>
-        <w:rPr>
           <w:i w:val="1"/>
           <w:iCs w:val="1"/>
           <w:sz w:val="20"/>
@@ -903,13 +893,35 @@
           <w:szCs w:val="20"/>
           <w:rtl w:val="0"/>
         </w:rPr>
-        <w:t xml:space="preserve">, y todo eso se traduce a los runs correspondientes del formato.</w:t>
-      </w:r>
-    </w:p>
-    <w:p>
-      <w:pPr>
-        <w:pageBreakBefore w:val="0"/>
+        <w:t xml:space="preserve">. La </w:t>
+      </w:r>
+      <w:r>
+        <w:rPr>
+          <w:sz w:val="20"/>
+          <w:szCs w:val="20"/>
+          <w:rtl w:val="0"/>
+        </w:rPr>
+        <w:t xml:space="preserve">negrita</w:t>
+      </w:r>
+      <w:r>
+        <w:rPr>
+          <w:sz w:val="20"/>
+          <w:szCs w:val="20"/>
+          <w:rtl w:val="0"/>
+        </w:rPr>
+        <w:t xml:space="preserve"> no: por regla de la casa sale como texto normal, y el generador avisa cuantas encontro.</w:t>
+      </w:r>
+    </w:p>
+    <w:p>
+      <w:pPr>
+        <w:pStyle w:val="Heading3"/>
+        <w:pageBreakBefore w:val="0"/>
+        <w:numPr>
+          <w:ilvl w:val="1"/>
+          <w:numId w:val="92"/>
+        </w:numPr>
         <w:spacing w:after="60" w:line="264" w:lineRule="auto"/>
+        <w:outlineLvl w:val="2"/>
       </w:pPr>
       <w:r>
         <w:rPr>
@@ -933,14 +945,19 @@
           <w:szCs w:val="20"/>
           <w:rtl w:val="0"/>
         </w:rPr>
-        <w:t xml:space="preserve">Los subtitulos van en negrita de 11 puntos y no entran al indice, para que el indice liste solo las secciones.</w:t>
+        <w:t xml:space="preserve">Los subtitulos van en negrita de 11 puntos. La numeracion (1, 1.1) la pone Word, no el markdown, y con ella entran al indice.</w:t>
       </w:r>
     </w:p>
     <w:p>
       <w:pPr>
         <w:pStyle w:val="Heading2"/>
         <w:pageBreakBefore w:val="0"/>
+        <w:numPr>
+          <w:ilvl w:val="0"/>
+          <w:numId w:val="92"/>
+        </w:numPr>
         <w:spacing w:before="240" w:line="276" w:lineRule="auto"/>
+        <w:outlineLvl w:val="1"/>
         <w:rPr/>
       </w:pPr>
       <w:r>
@@ -1234,25 +1251,7 @@
           <w:szCs w:val="20"/>
           <w:rtl w:val="0"/>
         </w:rPr>
-        <w:t xml:space="preserve">Segundo elemento, con </w:t>
-      </w:r>
-      <w:r>
-        <w:rPr>
-          <w:b w:val="1"/>
-          <w:bCs w:val="1"/>
-          <w:sz w:val="20"/>
-          <w:szCs w:val="20"/>
-          <w:rtl w:val="0"/>
-        </w:rPr>
-        <w:t xml:space="preserve">algo en negrita</w:t>
-      </w:r>
-      <w:r>
-        <w:rPr>
-          <w:sz w:val="20"/>
-          <w:szCs w:val="20"/>
-          <w:rtl w:val="0"/>
-        </w:rPr>
-        <w:t xml:space="preserve"> adentro</w:t>
+        <w:t xml:space="preserve">Segundo elemento, con algo de texto adentro</w:t>
       </w:r>
     </w:p>
     <w:p>
@@ -1301,7 +1300,7 @@
         <w:pStyle w:val="Normal"/>
         <w:numPr>
           <w:ilvl w:val="0"/>
-          <w:numId w:val="91"/>
+          <w:numId w:val="100"/>
         </w:numPr>
         <w:spacing w:after="80" w:line="264" w:lineRule="auto"/>
       </w:pPr>
@@ -1319,7 +1318,7 @@
         <w:pStyle w:val="Normal"/>
         <w:numPr>
           <w:ilvl w:val="0"/>
-          <w:numId w:val="91"/>
+          <w:numId w:val="100"/>
         </w:numPr>
         <w:spacing w:after="80" w:line="264" w:lineRule="auto"/>
       </w:pPr>
@@ -1337,7 +1336,7 @@
         <w:pStyle w:val="Normal"/>
         <w:numPr>
           <w:ilvl w:val="0"/>
-          <w:numId w:val="91"/>
+          <w:numId w:val="100"/>
         </w:numPr>
         <w:spacing w:after="80" w:line="264" w:lineRule="auto"/>
       </w:pPr>
@@ -1354,7 +1353,12 @@
       <w:pPr>
         <w:pStyle w:val="Heading2"/>
         <w:pageBreakBefore w:val="0"/>
+        <w:numPr>
+          <w:ilvl w:val="0"/>
+          <w:numId w:val="92"/>
+        </w:numPr>
         <w:spacing w:before="240" w:line="276" w:lineRule="auto"/>
+        <w:outlineLvl w:val="1"/>
         <w:rPr/>
       </w:pPr>
       <w:r>
@@ -1652,6 +1656,7 @@
           <w:p>
             <w:pPr>
               <w:spacing w:after="20" w:line="240" w:lineRule="auto"/>
+              <w:jc w:val="left"/>
             </w:pPr>
             <w:r>
               <w:rPr>
@@ -1681,6 +1686,7 @@
           <w:p>
             <w:pPr>
               <w:spacing w:after="20" w:line="240" w:lineRule="auto"/>
+              <w:jc w:val="left"/>
             </w:pPr>
             <w:r>
               <w:rPr>
@@ -1710,6 +1716,7 @@
           <w:p>
             <w:pPr>
               <w:spacing w:after="20" w:line="240" w:lineRule="auto"/>
+              <w:jc w:val="left"/>
             </w:pPr>
             <w:r>
               <w:rPr>
@@ -1741,6 +1748,7 @@
           <w:p>
             <w:pPr>
               <w:spacing w:after="20" w:line="240" w:lineRule="auto"/>
+              <w:jc w:val="left"/>
             </w:pPr>
             <w:r>
               <w:rPr>
@@ -1767,6 +1775,7 @@
           <w:p>
             <w:pPr>
               <w:spacing w:after="20" w:line="240" w:lineRule="auto"/>
+              <w:jc w:val="left"/>
             </w:pPr>
             <w:r>
               <w:rPr>
@@ -1793,6 +1802,7 @@
           <w:p>
             <w:pPr>
               <w:spacing w:after="20" w:line="240" w:lineRule="auto"/>
+              <w:jc w:val="left"/>
             </w:pPr>
             <w:r>
               <w:rPr>
@@ -1821,6 +1831,7 @@
           <w:p>
             <w:pPr>
               <w:spacing w:after="20" w:line="240" w:lineRule="auto"/>
+              <w:jc w:val="left"/>
             </w:pPr>
             <w:r>
               <w:rPr>
@@ -1847,6 +1858,7 @@
           <w:p>
             <w:pPr>
               <w:spacing w:after="20" w:line="240" w:lineRule="auto"/>
+              <w:jc w:val="left"/>
             </w:pPr>
             <w:r>
               <w:rPr>
@@ -1873,6 +1885,7 @@
           <w:p>
             <w:pPr>
               <w:spacing w:after="20" w:line="240" w:lineRule="auto"/>
+              <w:jc w:val="left"/>
             </w:pPr>
             <w:r>
               <w:rPr>
@@ -1901,6 +1914,7 @@
           <w:p>
             <w:pPr>
               <w:spacing w:after="20" w:line="240" w:lineRule="auto"/>
+              <w:jc w:val="left"/>
             </w:pPr>
             <w:r>
               <w:rPr>
@@ -1927,6 +1941,7 @@
           <w:p>
             <w:pPr>
               <w:spacing w:after="20" w:line="240" w:lineRule="auto"/>
+              <w:jc w:val="left"/>
             </w:pPr>
             <w:r>
               <w:rPr>
@@ -1953,6 +1968,7 @@
           <w:p>
             <w:pPr>
               <w:spacing w:after="20" w:line="240" w:lineRule="auto"/>
+              <w:jc w:val="left"/>
             </w:pPr>
             <w:r>
               <w:rPr>
@@ -1984,7 +2000,12 @@
       <w:pPr>
         <w:pStyle w:val="Heading2"/>
         <w:pageBreakBefore w:val="0"/>
+        <w:numPr>
+          <w:ilvl w:val="0"/>
+          <w:numId w:val="92"/>
+        </w:numPr>
         <w:spacing w:before="240" w:line="276" w:lineRule="auto"/>
+        <w:outlineLvl w:val="1"/>
         <w:rPr/>
       </w:pPr>
       <w:r>
@@ -2309,7 +2330,12 @@
       <w:pPr>
         <w:pStyle w:val="Heading2"/>
         <w:pageBreakBefore w:val="0"/>
+        <w:numPr>
+          <w:ilvl w:val="0"/>
+          <w:numId w:val="92"/>
+        </w:numPr>
         <w:spacing w:before="240" w:line="276" w:lineRule="auto"/>
+        <w:outlineLvl w:val="1"/>
         <w:rPr/>
       </w:pPr>
       <w:r>
@@ -2582,7 +2608,12 @@
       <w:pPr>
         <w:pStyle w:val="Heading2"/>
         <w:pageBreakBefore w:val="0"/>
+        <w:numPr>
+          <w:ilvl w:val="0"/>
+          <w:numId w:val="92"/>
+        </w:numPr>
         <w:spacing w:before="240" w:line="276" w:lineRule="auto"/>
+        <w:outlineLvl w:val="1"/>
         <w:rPr/>
       </w:pPr>
       <w:r>
@@ -3771,6 +3802,48 @@
   </w:num>
   <w:num w:numId="91">
     <w:abstractNumId w:val="91"/>
+  </w:num>
+  <w:abstractNum w:abstractNumId="92">
+    <w:multiLevelType w:val="multilevel"/>
+    <w:lvl w:ilvl="0">
+      <w:start w:val="1"/>
+      <w:numFmt w:val="decimal"/>
+      <w:lvlText w:val="%1."/>
+      <w:lvlJc w:val="left"/>
+      <w:suff w:val="space"/>
+      <w:pPr>
+        <w:ind w:left="0" w:firstLine="0"/>
+      </w:pPr>
+    </w:lvl>
+    <w:lvl w:ilvl="1">
+      <w:start w:val="1"/>
+      <w:numFmt w:val="decimal"/>
+      <w:lvlText w:val="%1.%2"/>
+      <w:lvlJc w:val="left"/>
+      <w:suff w:val="space"/>
+      <w:pPr>
+        <w:ind w:left="0" w:firstLine="0"/>
+      </w:pPr>
+    </w:lvl>
+    <w:lvl w:ilvl="2">
+      <w:start w:val="1"/>
+      <w:numFmt w:val="decimal"/>
+      <w:lvlText w:val="%1.%2.%3"/>
+      <w:lvlJc w:val="left"/>
+      <w:suff w:val="space"/>
+      <w:pPr>
+        <w:ind w:left="0" w:firstLine="0"/>
+      </w:pPr>
+    </w:lvl>
+  </w:abstractNum>
+  <w:num w:numId="92">
+    <w:abstractNumId w:val="92"/>
+  </w:num>
+  <w:num w:numId="100">
+    <w:abstractNumId w:val="91"/>
+    <w:lvlOverride w:ilvl="0">
+      <w:startOverride w:val="1"/>
+    </w:lvlOverride>
   </w:num>
 </w:numbering>
 </file>

</xml_diff>

<commit_message>
Fix, mismo tamaño de numeración de subtitulos y color de subtitulos igual que el de los títulos
</commit_message>
<xml_diff>
--- a/ejemplo.docx
+++ b/ejemplo.docx
@@ -922,13 +922,21 @@
         </w:numPr>
         <w:spacing w:after="60" w:line="264" w:lineRule="auto"/>
         <w:outlineLvl w:val="2"/>
-      </w:pPr>
-      <w:r>
         <w:rPr>
           <w:b w:val="1"/>
           <w:bCs w:val="1"/>
+          <w:color w:val="001689"/>
           <w:sz w:val="22"/>
           <w:szCs w:val="22"/>
+        </w:rPr>
+      </w:pPr>
+      <w:r>
+        <w:rPr>
+          <w:b w:val="1"/>
+          <w:bCs w:val="1"/>
+          <w:color w:val="001689"/>
+          <w:sz w:val="22"/>
+          <w:szCs w:val="22"/>
           <w:rtl w:val="0"/>
         </w:rPr>
         <w:t xml:space="preserve">Un subtitulo</w:t>
@@ -945,7 +953,7 @@
           <w:szCs w:val="20"/>
           <w:rtl w:val="0"/>
         </w:rPr>
-        <w:t xml:space="preserve">Los subtitulos van en negrita de 11 puntos. La numeracion (1, 1.1) la pone Word, no el markdown, y con ella entran al indice.</w:t>
+        <w:t xml:space="preserve">Los subtitulos van en negrita azul de 11 puntos. La numeracion (1, 1.1) la pone Word, no el markdown, y con ella entran al indice.</w:t>
       </w:r>
     </w:p>
     <w:p>

</xml_diff>

<commit_message>
Cleanup: Código muerto, Comentarios desfasados, Funciones repetidas
</commit_message>
<xml_diff>
--- a/ejemplo.docx
+++ b/ejemplo.docx
@@ -1693,6 +1693,56 @@
           <w:rtl w:val="0"/>
         </w:rPr>
         <w:t xml:space="preserve">Tercer paso</w:t>
+      </w:r>
+    </w:p>
+    <w:p>
+      <w:pPr>
+        <w:pageBreakBefore w:val="0"/>
+        <w:spacing w:after="120" w:line="264" w:lineRule="auto"/>
+      </w:pPr>
+      <w:r>
+        <w:rPr>
+          <w:sz w:val="20"/>
+          <w:szCs w:val="20"/>
+          <w:rtl w:val="0"/>
+        </w:rPr>
+        <w:t xml:space="preserve">Cada lista numerada arranca de nuevo en 1, no sigue a la anterior:</w:t>
+      </w:r>
+    </w:p>
+    <w:p>
+      <w:pPr>
+        <w:pStyle w:val="786"/>
+        <w:numPr>
+          <w:ilvl w:val="0"/>
+          <w:numId w:val="101"/>
+        </w:numPr>
+        <w:spacing w:after="80" w:line="264" w:lineRule="auto"/>
+      </w:pPr>
+      <w:r>
+        <w:rPr>
+          <w:sz w:val="20"/>
+          <w:szCs w:val="20"/>
+          <w:rtl w:val="0"/>
+        </w:rPr>
+        <w:t xml:space="preserve">Primer paso de otro procedimiento</w:t>
+      </w:r>
+    </w:p>
+    <w:p>
+      <w:pPr>
+        <w:pStyle w:val="786"/>
+        <w:numPr>
+          <w:ilvl w:val="0"/>
+          <w:numId w:val="101"/>
+        </w:numPr>
+        <w:spacing w:after="80" w:line="264" w:lineRule="auto"/>
+      </w:pPr>
+      <w:r>
+        <w:rPr>
+          <w:sz w:val="20"/>
+          <w:szCs w:val="20"/>
+          <w:rtl w:val="0"/>
+        </w:rPr>
+        <w:t xml:space="preserve">Segundo paso</w:t>
       </w:r>
     </w:p>
     <w:p>
@@ -4900,6 +4950,12 @@
     <w:abstractNumId w:val="92"/>
   </w:num>
   <w:num w:numId="100">
+    <w:abstractNumId w:val="1"/>
+    <w:lvlOverride w:ilvl="0">
+      <w:startOverride w:val="1"/>
+    </w:lvlOverride>
+  </w:num>
+  <w:num w:numId="101">
     <w:abstractNumId w:val="1"/>
     <w:lvlOverride w:ilvl="0">
       <w:startOverride w:val="1"/>

</xml_diff>